<commit_message>
Actualizacion 2: Definicion y grafo del perceptron
</commit_message>
<xml_diff>
--- a/Bitácora de Clases - Técnicas de IA.docx
+++ b/Bitácora de Clases - Técnicas de IA.docx
@@ -191,6 +191,75 @@
           <w:rtl w:val="0"/>
         </w:rPr>
         <w:t xml:space="preserve">En nuestro primer día de clases, se llevó a cabo la presentación oficial de la materia y se establecieron los criterios de evaluación. Tras discutir la rigurosidad de la calificación, varios compañeros tomaron la decisión de darse de baja del curso. Personalmente, decidí permanecer en la clase para continuar con el programa establecido.</w:t>
+      </w:r>
+    </w:p>
+    <w:p>
+      <w:pPr>
+        <w:pBdr>
+          <w:top w:space="0" w:sz="0" w:val="nil"/>
+          <w:left w:space="0" w:sz="0" w:val="nil"/>
+          <w:bottom w:space="0" w:sz="0" w:val="nil"/>
+          <w:right w:space="0" w:sz="0" w:val="nil"/>
+          <w:between w:space="0" w:sz="0" w:val="nil"/>
+        </w:pBdr>
+        <w:shd w:fill="auto" w:val="clear"/>
+        <w:spacing w:after="225" w:lineRule="auto"/>
+        <w:rPr>
+          <w:rFonts w:ascii="Arial" w:cs="Arial" w:eastAsia="Arial" w:hAnsi="Arial"/>
+        </w:rPr>
+      </w:pPr>
+      <w:r>
+        <w:rPr>
+          <w:rtl w:val="0"/>
+        </w:rPr>
+      </w:r>
+    </w:p>
+    <w:p>
+      <w:pPr>
+        <w:pStyle w:val="Heading2"/>
+        <w:pBdr>
+          <w:top w:space="0" w:sz="0" w:val="nil"/>
+          <w:left w:space="0" w:sz="0" w:val="nil"/>
+          <w:bottom w:space="0" w:sz="0" w:val="nil"/>
+          <w:right w:space="0" w:sz="0" w:val="nil"/>
+          <w:between w:space="0" w:sz="0" w:val="nil"/>
+        </w:pBdr>
+        <w:shd w:fill="auto" w:val="clear"/>
+        <w:rPr>
+          <w:rFonts w:ascii="Arial" w:cs="Arial" w:eastAsia="Arial" w:hAnsi="Arial"/>
+          <w:color w:val="34495e"/>
+        </w:rPr>
+      </w:pPr>
+      <w:r>
+        <w:rPr>
+          <w:rFonts w:ascii="Arial" w:cs="Arial" w:eastAsia="Arial" w:hAnsi="Arial"/>
+          <w:color w:val="34495e"/>
+          <w:rtl w:val="0"/>
+        </w:rPr>
+        <w:t xml:space="preserve">Día 2</w:t>
+      </w:r>
+    </w:p>
+    <w:p>
+      <w:pPr>
+        <w:pBdr>
+          <w:top w:space="0" w:sz="0" w:val="nil"/>
+          <w:left w:space="0" w:sz="0" w:val="nil"/>
+          <w:bottom w:space="0" w:sz="0" w:val="nil"/>
+          <w:right w:space="0" w:sz="0" w:val="nil"/>
+          <w:between w:space="0" w:sz="0" w:val="nil"/>
+        </w:pBdr>
+        <w:shd w:fill="auto" w:val="clear"/>
+        <w:spacing w:line="275.9999942779541" w:lineRule="auto"/>
+        <w:rPr>
+          <w:rFonts w:ascii="Arial" w:cs="Arial" w:eastAsia="Arial" w:hAnsi="Arial"/>
+        </w:rPr>
+      </w:pPr>
+      <w:r>
+        <w:rPr>
+          <w:rFonts w:ascii="Arial" w:cs="Arial" w:eastAsia="Arial" w:hAnsi="Arial"/>
+          <w:rtl w:val="0"/>
+        </w:rPr>
+        <w:t xml:space="preserve">La segunda sesión se centró en el estudio del perceptrón. Llevamos a cabo una investigación detallada sobre su definición y su importancia como unidad fundamental dentro de la inteligencia artificial. Para complementar la teoría y entender mejor su arquitectura, elaboramos un grafo representativo de su estructura y discutimos su implementación.</w:t>
       </w:r>
     </w:p>
     <w:p>

</xml_diff>

<commit_message>
Actualizacion 3: Funcion de Ackley
</commit_message>
<xml_diff>
--- a/Bitácora de Clases - Técnicas de IA.docx
+++ b/Bitácora de Clases - Técnicas de IA.docx
@@ -285,6 +285,31 @@
     </w:p>
     <w:p>
       <w:pPr>
+        <w:pStyle w:val="Heading2"/>
+        <w:pBdr>
+          <w:top w:space="0" w:sz="0" w:val="nil"/>
+          <w:left w:space="0" w:sz="0" w:val="nil"/>
+          <w:bottom w:space="0" w:sz="0" w:val="nil"/>
+          <w:right w:space="0" w:sz="0" w:val="nil"/>
+          <w:between w:space="0" w:sz="0" w:val="nil"/>
+        </w:pBdr>
+        <w:shd w:fill="auto" w:val="clear"/>
+        <w:rPr>
+          <w:rFonts w:ascii="Arial" w:cs="Arial" w:eastAsia="Arial" w:hAnsi="Arial"/>
+          <w:color w:val="34495e"/>
+        </w:rPr>
+      </w:pPr>
+      <w:r>
+        <w:rPr>
+          <w:rFonts w:ascii="Arial" w:cs="Arial" w:eastAsia="Arial" w:hAnsi="Arial"/>
+          <w:color w:val="34495e"/>
+          <w:rtl w:val="0"/>
+        </w:rPr>
+        <w:t xml:space="preserve">Día 3</w:t>
+      </w:r>
+    </w:p>
+    <w:p>
+      <w:pPr>
         <w:pBdr>
           <w:top w:space="0" w:sz="0" w:val="nil"/>
           <w:left w:space="0" w:sz="0" w:val="nil"/>
@@ -300,8 +325,10 @@
       </w:pPr>
       <w:r>
         <w:rPr>
-          <w:rtl w:val="0"/>
-        </w:rPr>
+          <w:rFonts w:ascii="Arial" w:cs="Arial" w:eastAsia="Arial" w:hAnsi="Arial"/>
+          <w:rtl w:val="0"/>
+        </w:rPr>
+        <w:t xml:space="preserve">En el tercer día abordamos el tema de las funciones objetivo, enfocándonos específicamente en la Función de Ackley. Analizamos la estructura de su fórmula matemática y sus constantes principales (a=20, b=0.2, c=2π). Además, discutimos la explicación teórica de esta función y su resolución en un plano 3D.</w:t>
       </w:r>
     </w:p>
     <w:sectPr>

</xml_diff>

<commit_message>
Actualizacion 4: Agregado del Dia 4 y planteamiento del proyecto
</commit_message>
<xml_diff>
--- a/Bitácora de Clases - Técnicas de IA.docx
+++ b/Bitácora de Clases - Técnicas de IA.docx
@@ -134,6 +134,64 @@
           <w:between w:space="0" w:sz="0" w:val="nil"/>
         </w:pBdr>
         <w:shd w:fill="auto" w:val="clear"/>
+        <w:spacing w:line="275.9999942779541" w:lineRule="auto"/>
+        <w:jc w:val="center"/>
+        <w:rPr>
+          <w:b w:val="1"/>
+          <w:bCs w:val="1"/>
+          <w:i w:val="1"/>
+          <w:iCs w:val="1"/>
+          <w:u w:val="single"/>
+        </w:rPr>
+      </w:pPr>
+      <w:r>
+        <w:rPr>
+          <w:rtl w:val="0"/>
+        </w:rPr>
+      </w:r>
+    </w:p>
+    <w:p>
+      <w:pPr>
+        <w:pBdr>
+          <w:top w:space="0" w:sz="0" w:val="nil"/>
+          <w:left w:space="0" w:sz="0" w:val="nil"/>
+          <w:bottom w:space="0" w:sz="0" w:val="nil"/>
+          <w:right w:space="0" w:sz="0" w:val="nil"/>
+          <w:between w:space="0" w:sz="0" w:val="nil"/>
+        </w:pBdr>
+        <w:shd w:fill="auto" w:val="clear"/>
+        <w:spacing w:line="275.9999942779541" w:lineRule="auto"/>
+        <w:jc w:val="center"/>
+        <w:rPr>
+          <w:b w:val="1"/>
+          <w:bCs w:val="1"/>
+          <w:i w:val="1"/>
+          <w:iCs w:val="1"/>
+          <w:u w:val="single"/>
+        </w:rPr>
+      </w:pPr>
+      <w:r>
+        <w:rPr>
+          <w:b w:val="1"/>
+          <w:bCs w:val="1"/>
+          <w:i w:val="1"/>
+          <w:iCs w:val="1"/>
+          <w:u w:val="single"/>
+          <w:rtl w:val="0"/>
+        </w:rPr>
+        <w:t xml:space="preserve">Semana del 24 al 28 de Agosto:</w:t>
+      </w:r>
+    </w:p>
+    <w:p>
+      <w:pPr>
+        <w:pBdr>
+          <w:top w:space="0" w:sz="0" w:val="nil"/>
+          <w:left w:space="0" w:sz="0" w:val="nil"/>
+          <w:bottom w:space="0" w:sz="0" w:val="nil"/>
+          <w:right w:space="0" w:sz="0" w:val="nil"/>
+          <w:between w:space="0" w:sz="0" w:val="nil"/>
+        </w:pBdr>
+        <w:shd w:fill="auto" w:val="clear"/>
         <w:spacing w:after="225" w:lineRule="auto"/>
         <w:rPr>
           <w:rFonts w:ascii="Arial" w:cs="Arial" w:eastAsia="Arial" w:hAnsi="Arial"/>
@@ -167,7 +225,7 @@
           <w:color w:val="34495e"/>
           <w:rtl w:val="0"/>
         </w:rPr>
-        <w:t xml:space="preserve">Día 1</w:t>
+        <w:t xml:space="preserve">Día 1 </w:t>
       </w:r>
     </w:p>
     <w:p>
@@ -331,13 +389,432 @@
         <w:t xml:space="preserve">En el tercer día abordamos el tema de las funciones objetivo, enfocándonos específicamente en la Función de Ackley. Analizamos la estructura de su fórmula matemática y sus constantes principales (a=20, b=0.2, c=2π). Además, discutimos la explicación teórica de esta función y su resolución en un plano 3D.</w:t>
       </w:r>
     </w:p>
+    <w:p>
+      <w:pPr>
+        <w:pBdr>
+          <w:top w:space="0" w:sz="0" w:val="nil"/>
+          <w:left w:space="0" w:sz="0" w:val="nil"/>
+          <w:bottom w:space="0" w:sz="0" w:val="nil"/>
+          <w:right w:space="0" w:sz="0" w:val="nil"/>
+          <w:between w:space="0" w:sz="0" w:val="nil"/>
+        </w:pBdr>
+        <w:shd w:fill="auto" w:val="clear"/>
+        <w:spacing w:line="275.9999942779541" w:lineRule="auto"/>
+        <w:rPr/>
+      </w:pPr>
+      <w:r>
+        <w:rPr>
+          <w:rtl w:val="0"/>
+        </w:rPr>
+      </w:r>
+    </w:p>
+    <w:p>
+      <w:pPr>
+        <w:pBdr>
+          <w:top w:space="0" w:sz="0" w:val="nil"/>
+          <w:left w:space="0" w:sz="0" w:val="nil"/>
+          <w:bottom w:space="0" w:sz="0" w:val="nil"/>
+          <w:right w:space="0" w:sz="0" w:val="nil"/>
+          <w:between w:space="0" w:sz="0" w:val="nil"/>
+        </w:pBdr>
+        <w:shd w:fill="auto" w:val="clear"/>
+        <w:spacing w:line="275.9999942779541" w:lineRule="auto"/>
+        <w:rPr/>
+      </w:pPr>
+      <w:r>
+        <w:rPr>
+          <w:rtl w:val="0"/>
+        </w:rPr>
+      </w:r>
+    </w:p>
+    <w:p>
+      <w:pPr>
+        <w:pBdr>
+          <w:top w:space="0" w:sz="0" w:val="nil"/>
+          <w:left w:space="0" w:sz="0" w:val="nil"/>
+          <w:bottom w:space="0" w:sz="0" w:val="nil"/>
+          <w:right w:space="0" w:sz="0" w:val="nil"/>
+          <w:between w:space="0" w:sz="0" w:val="nil"/>
+        </w:pBdr>
+        <w:shd w:fill="auto" w:val="clear"/>
+        <w:spacing w:line="275.9999942779541" w:lineRule="auto"/>
+        <w:rPr/>
+      </w:pPr>
+      <w:r>
+        <w:rPr>
+          <w:rtl w:val="0"/>
+        </w:rPr>
+      </w:r>
+    </w:p>
+    <w:p>
+      <w:pPr>
+        <w:pBdr>
+          <w:top w:space="0" w:sz="0" w:val="nil"/>
+          <w:left w:space="0" w:sz="0" w:val="nil"/>
+          <w:bottom w:space="0" w:sz="0" w:val="nil"/>
+          <w:right w:space="0" w:sz="0" w:val="nil"/>
+          <w:between w:space="0" w:sz="0" w:val="nil"/>
+        </w:pBdr>
+        <w:shd w:fill="auto" w:val="clear"/>
+        <w:spacing w:line="275.9999942779541" w:lineRule="auto"/>
+        <w:rPr/>
+      </w:pPr>
+      <w:r>
+        <w:rPr>
+          <w:rtl w:val="0"/>
+        </w:rPr>
+      </w:r>
+    </w:p>
+    <w:p>
+      <w:pPr>
+        <w:pBdr>
+          <w:top w:space="0" w:sz="0" w:val="nil"/>
+          <w:left w:space="0" w:sz="0" w:val="nil"/>
+          <w:bottom w:space="0" w:sz="0" w:val="nil"/>
+          <w:right w:space="0" w:sz="0" w:val="nil"/>
+          <w:between w:space="0" w:sz="0" w:val="nil"/>
+        </w:pBdr>
+        <w:shd w:fill="auto" w:val="clear"/>
+        <w:spacing w:line="275.9999942779541" w:lineRule="auto"/>
+        <w:rPr/>
+      </w:pPr>
+      <w:r>
+        <w:rPr>
+          <w:rtl w:val="0"/>
+        </w:rPr>
+      </w:r>
+    </w:p>
+    <w:p>
+      <w:pPr>
+        <w:pBdr>
+          <w:top w:space="0" w:sz="0" w:val="nil"/>
+          <w:left w:space="0" w:sz="0" w:val="nil"/>
+          <w:bottom w:space="0" w:sz="0" w:val="nil"/>
+          <w:right w:space="0" w:sz="0" w:val="nil"/>
+          <w:between w:space="0" w:sz="0" w:val="nil"/>
+        </w:pBdr>
+        <w:shd w:fill="auto" w:val="clear"/>
+        <w:spacing w:line="275.9999942779541" w:lineRule="auto"/>
+        <w:rPr/>
+      </w:pPr>
+      <w:r>
+        <w:rPr>
+          <w:rtl w:val="0"/>
+        </w:rPr>
+      </w:r>
+    </w:p>
+    <w:p>
+      <w:pPr>
+        <w:pBdr>
+          <w:top w:space="0" w:sz="0" w:val="nil"/>
+          <w:left w:space="0" w:sz="0" w:val="nil"/>
+          <w:bottom w:space="0" w:sz="0" w:val="nil"/>
+          <w:right w:space="0" w:sz="0" w:val="nil"/>
+          <w:between w:space="0" w:sz="0" w:val="nil"/>
+        </w:pBdr>
+        <w:shd w:fill="auto" w:val="clear"/>
+        <w:spacing w:line="275.9999942779541" w:lineRule="auto"/>
+        <w:rPr/>
+      </w:pPr>
+      <w:r>
+        <w:rPr>
+          <w:rtl w:val="0"/>
+        </w:rPr>
+      </w:r>
+    </w:p>
+    <w:p>
+      <w:pPr>
+        <w:pBdr>
+          <w:top w:space="0" w:sz="0" w:val="nil"/>
+          <w:left w:space="0" w:sz="0" w:val="nil"/>
+          <w:bottom w:space="0" w:sz="0" w:val="nil"/>
+          <w:right w:space="0" w:sz="0" w:val="nil"/>
+          <w:between w:space="0" w:sz="0" w:val="nil"/>
+        </w:pBdr>
+        <w:shd w:fill="auto" w:val="clear"/>
+        <w:spacing w:line="275.9999942779541" w:lineRule="auto"/>
+        <w:rPr/>
+      </w:pPr>
+      <w:r>
+        <w:rPr>
+          <w:rtl w:val="0"/>
+        </w:rPr>
+      </w:r>
+    </w:p>
+    <w:p>
+      <w:pPr>
+        <w:spacing w:line="275.9999942779541" w:lineRule="auto"/>
+        <w:jc w:val="center"/>
+        <w:rPr>
+          <w:b w:val="1"/>
+          <w:bCs w:val="1"/>
+          <w:i w:val="1"/>
+          <w:iCs w:val="1"/>
+          <w:u w:val="single"/>
+        </w:rPr>
+      </w:pPr>
+      <w:r>
+        <w:rPr>
+          <w:b w:val="1"/>
+          <w:bCs w:val="1"/>
+          <w:i w:val="1"/>
+          <w:iCs w:val="1"/>
+          <w:u w:val="single"/>
+          <w:rtl w:val="0"/>
+        </w:rPr>
+        <w:t xml:space="preserve">Semana del 31 de Agosto al 4 de Septiembre:</w:t>
+      </w:r>
+    </w:p>
+    <w:p>
+      <w:pPr>
+        <w:spacing w:line="275.9999942779541" w:lineRule="auto"/>
+        <w:jc w:val="center"/>
+        <w:rPr>
+          <w:b w:val="1"/>
+          <w:bCs w:val="1"/>
+          <w:i w:val="1"/>
+          <w:iCs w:val="1"/>
+          <w:u w:val="single"/>
+        </w:rPr>
+      </w:pPr>
+      <w:r>
+        <w:rPr>
+          <w:rtl w:val="0"/>
+        </w:rPr>
+      </w:r>
+    </w:p>
+    <w:p>
+      <w:pPr>
+        <w:pStyle w:val="Heading2"/>
+        <w:rPr>
+          <w:color w:val="34495e"/>
+        </w:rPr>
+      </w:pPr>
+      <w:bookmarkStart w:colFirst="0" w:colLast="0" w:name="_f1juol8xxl38" w:id="0"/>
+      <w:bookmarkEnd w:id="0"/>
+      <w:r>
+        <w:rPr>
+          <w:color w:val="34495e"/>
+          <w:rtl w:val="0"/>
+        </w:rPr>
+        <w:t xml:space="preserve">Día 4</w:t>
+      </w:r>
+    </w:p>
+    <w:p>
+      <w:pPr>
+        <w:rPr/>
+      </w:pPr>
+      <w:r>
+        <w:rPr>
+          <w:rtl w:val="0"/>
+        </w:rPr>
+        <w:t xml:space="preserve">En este día desglosamos con más detalle nuestro proyecto viable asignando un título en mi caso: WAItt (Water-Aware Artificial Intelligence Thermal-Throttling) junto con un planteamiento del problema una justificación digna, hipótesis junto con sus objetivos generales y específicos mediante alguna metodología agregando la fase de experimentación para llegar a una conclusión.</w:t>
+      </w:r>
+      <w:r>
+        <w:rPr>
+          <w:rtl w:val="0"/>
+        </w:rPr>
+      </w:r>
+    </w:p>
+    <w:p>
+      <w:pPr>
+        <w:spacing w:line="275.9999942779541" w:lineRule="auto"/>
+        <w:jc w:val="center"/>
+        <w:rPr>
+          <w:b w:val="1"/>
+          <w:bCs w:val="1"/>
+          <w:i w:val="1"/>
+          <w:iCs w:val="1"/>
+          <w:u w:val="single"/>
+        </w:rPr>
+      </w:pPr>
+      <w:r>
+        <w:rPr>
+          <w:rtl w:val="0"/>
+        </w:rPr>
+      </w:r>
+    </w:p>
+    <w:p>
+      <w:pPr>
+        <w:spacing w:line="275.9999942779541" w:lineRule="auto"/>
+        <w:jc w:val="center"/>
+        <w:rPr>
+          <w:b w:val="1"/>
+          <w:bCs w:val="1"/>
+          <w:i w:val="1"/>
+          <w:iCs w:val="1"/>
+          <w:u w:val="single"/>
+        </w:rPr>
+      </w:pPr>
+      <w:r>
+        <w:rPr>
+          <w:rtl w:val="0"/>
+        </w:rPr>
+      </w:r>
+    </w:p>
+    <w:p>
+      <w:pPr>
+        <w:spacing w:line="275.9999942779541" w:lineRule="auto"/>
+        <w:jc w:val="center"/>
+        <w:rPr>
+          <w:b w:val="1"/>
+          <w:bCs w:val="1"/>
+          <w:i w:val="1"/>
+          <w:iCs w:val="1"/>
+          <w:u w:val="single"/>
+        </w:rPr>
+      </w:pPr>
+      <w:r>
+        <w:rPr>
+          <w:rtl w:val="0"/>
+        </w:rPr>
+      </w:r>
+    </w:p>
+    <w:p>
+      <w:pPr>
+        <w:spacing w:line="275.9999942779541" w:lineRule="auto"/>
+        <w:jc w:val="center"/>
+        <w:rPr>
+          <w:b w:val="1"/>
+          <w:bCs w:val="1"/>
+          <w:i w:val="1"/>
+          <w:iCs w:val="1"/>
+          <w:u w:val="single"/>
+        </w:rPr>
+      </w:pPr>
+      <w:r>
+        <w:rPr>
+          <w:rtl w:val="0"/>
+        </w:rPr>
+      </w:r>
+    </w:p>
     <w:sectPr>
+      <w:headerReference r:id="rId6" w:type="default"/>
+      <w:footerReference r:id="rId7" w:type="default"/>
       <w:pgSz w:h="15840" w:w="12240" w:orient="portrait"/>
       <w:pgMar w:bottom="1440" w:top="1440" w:left="1440" w:right="1440" w:header="0" w:footer="720"/>
       <w:pgNumType w:start="1"/>
     </w:sectPr>
   </w:body>
 </w:document>
+</file>
+
+<file path=word/footer1.xml><?xml version="1.0" encoding="utf-8"?>
+<w:ftr xmlns:mc="http://schemas.openxmlformats.org/markup-compatibility/2006" xmlns:o="urn:schemas-microsoft-com:office:office" xmlns:r="http://schemas.openxmlformats.org/officeDocument/2006/relationships" xmlns:m="http://schemas.openxmlformats.org/officeDocument/2006/math" xmlns:v="urn:schemas-microsoft-com:vml" xmlns:wp="http://schemas.openxmlformats.org/drawingml/2006/wordprocessingDrawing" xmlns:w10="urn:schemas-microsoft-com:office:word" xmlns:w="http://schemas.openxmlformats.org/wordprocessingml/2006/main" xmlns:wne="http://schemas.microsoft.com/office/word/2006/wordml" xmlns:sl="http://schemas.openxmlformats.org/schemaLibrary/2006/main" xmlns:a="http://schemas.openxmlformats.org/drawingml/2006/main" xmlns:pic="http://schemas.openxmlformats.org/drawingml/2006/picture" xmlns:c="http://schemas.openxmlformats.org/drawingml/2006/chart" xmlns:lc="http://schemas.openxmlformats.org/drawingml/2006/lockedCanvas" xmlns:dgm="http://schemas.openxmlformats.org/drawingml/2006/diagram" xmlns:wps="http://schemas.microsoft.com/office/word/2010/wordprocessingShape" xmlns:wpg="http://schemas.microsoft.com/office/word/2010/wordprocessingGroup" xmlns:w14="http://schemas.microsoft.com/office/word/2010/wordml" xmlns:w15="http://schemas.microsoft.com/office/word/2012/wordml" xmlns:w16="http://schemas.microsoft.com/office/word/2018/wordml" xmlns:w16cex="http://schemas.microsoft.com/office/word/2018/wordml/cex" xmlns:w16cid="http://schemas.microsoft.com/office/word/2016/wordml/cid" xmlns="http://schemas.microsoft.com/office/tasks/2019/documenttasks" xmlns:cr="http://schemas.microsoft.com/office/comments/2020/reactions">
+  <w:p>
+    <w:pPr>
+      <w:rPr/>
+    </w:pPr>
+    <w:r>
+      <w:rPr>
+        <w:rtl w:val="0"/>
+      </w:rPr>
+    </w:r>
+  </w:p>
+  <w:p>
+    <w:pPr>
+      <w:jc w:val="center"/>
+      <w:rPr>
+        <w:rFonts w:ascii="Consolas" w:cs="Consolas" w:eastAsia="Consolas" w:hAnsi="Consolas"/>
+        <w:i w:val="1"/>
+        <w:iCs w:val="1"/>
+        <w:sz w:val="20"/>
+        <w:szCs w:val="20"/>
+      </w:rPr>
+    </w:pPr>
+    <w:r>
+      <w:rPr>
+        <w:rFonts w:ascii="Consolas" w:cs="Consolas" w:eastAsia="Consolas" w:hAnsi="Consolas"/>
+        <w:i w:val="1"/>
+        <w:iCs w:val="1"/>
+        <w:sz w:val="20"/>
+        <w:szCs w:val="20"/>
+        <w:rtl w:val="0"/>
+      </w:rPr>
+      <w:t xml:space="preserve">Carlos Said Sánchez Domínguez                                                       </w:t>
+    </w:r>
+    <w:r>
+      <w:rPr>
+        <w:rFonts w:ascii="Consolas" w:cs="Consolas" w:eastAsia="Consolas" w:hAnsi="Consolas"/>
+        <w:i w:val="1"/>
+        <w:iCs w:val="1"/>
+        <w:sz w:val="20"/>
+        <w:szCs w:val="20"/>
+      </w:rPr>
+      <w:fldChar w:fldCharType="begin"/>
+      <w:instrText xml:space="preserve">PAGE</w:instrText>
+      <w:fldChar w:fldCharType="separate"/>
+      <w:fldChar w:fldCharType="end"/>
+    </w:r>
+    <w:r>
+      <w:rPr>
+        <w:rtl w:val="0"/>
+      </w:rPr>
+    </w:r>
+  </w:p>
+</w:ftr>
+</file>
+
+<file path=word/header1.xml><?xml version="1.0" encoding="utf-8"?>
+<w:hdr xmlns:mc="http://schemas.openxmlformats.org/markup-compatibility/2006" xmlns:o="urn:schemas-microsoft-com:office:office" xmlns:r="http://schemas.openxmlformats.org/officeDocument/2006/relationships" xmlns:m="http://schemas.openxmlformats.org/officeDocument/2006/math" xmlns:v="urn:schemas-microsoft-com:vml" xmlns:wp="http://schemas.openxmlformats.org/drawingml/2006/wordprocessingDrawing" xmlns:w10="urn:schemas-microsoft-com:office:word" xmlns:w="http://schemas.openxmlformats.org/wordprocessingml/2006/main" xmlns:wne="http://schemas.microsoft.com/office/word/2006/wordml" xmlns:sl="http://schemas.openxmlformats.org/schemaLibrary/2006/main" xmlns:a="http://schemas.openxmlformats.org/drawingml/2006/main" xmlns:pic="http://schemas.openxmlformats.org/drawingml/2006/picture" xmlns:c="http://schemas.openxmlformats.org/drawingml/2006/chart" xmlns:lc="http://schemas.openxmlformats.org/drawingml/2006/lockedCanvas" xmlns:dgm="http://schemas.openxmlformats.org/drawingml/2006/diagram" xmlns:wps="http://schemas.microsoft.com/office/word/2010/wordprocessingShape" xmlns:wpg="http://schemas.microsoft.com/office/word/2010/wordprocessingGroup" xmlns:w14="http://schemas.microsoft.com/office/word/2010/wordml" xmlns:w15="http://schemas.microsoft.com/office/word/2012/wordml" xmlns:w16="http://schemas.microsoft.com/office/word/2018/wordml" xmlns:w16cex="http://schemas.microsoft.com/office/word/2018/wordml/cex" xmlns:w16cid="http://schemas.microsoft.com/office/word/2016/wordml/cid" xmlns="http://schemas.microsoft.com/office/tasks/2019/documenttasks" xmlns:cr="http://schemas.microsoft.com/office/comments/2020/reactions">
+  <w:p>
+    <w:pPr>
+      <w:jc w:val="center"/>
+      <w:rPr>
+        <w:rFonts w:ascii="Consolas" w:cs="Consolas" w:eastAsia="Consolas" w:hAnsi="Consolas"/>
+        <w:i w:val="1"/>
+        <w:iCs w:val="1"/>
+        <w:sz w:val="20"/>
+        <w:szCs w:val="20"/>
+      </w:rPr>
+    </w:pPr>
+    <w:r>
+      <w:rPr>
+        <w:rtl w:val="0"/>
+      </w:rPr>
+    </w:r>
+  </w:p>
+  <w:p>
+    <w:pPr>
+      <w:jc w:val="center"/>
+      <w:rPr>
+        <w:rFonts w:ascii="Consolas" w:cs="Consolas" w:eastAsia="Consolas" w:hAnsi="Consolas"/>
+        <w:i w:val="1"/>
+        <w:iCs w:val="1"/>
+        <w:sz w:val="20"/>
+        <w:szCs w:val="20"/>
+      </w:rPr>
+    </w:pPr>
+    <w:r>
+      <w:rPr>
+        <w:rFonts w:ascii="Consolas" w:cs="Consolas" w:eastAsia="Consolas" w:hAnsi="Consolas"/>
+        <w:i w:val="1"/>
+        <w:iCs w:val="1"/>
+        <w:sz w:val="20"/>
+        <w:szCs w:val="20"/>
+        <w:rtl w:val="0"/>
+      </w:rPr>
+      <w:t xml:space="preserve">Técnicas de Inteligencia Artificial</w:t>
+    </w:r>
+  </w:p>
+  <w:p>
+    <w:pPr>
+      <w:jc w:val="center"/>
+      <w:rPr>
+        <w:rFonts w:ascii="Consolas" w:cs="Consolas" w:eastAsia="Consolas" w:hAnsi="Consolas"/>
+        <w:i w:val="1"/>
+        <w:iCs w:val="1"/>
+        <w:sz w:val="20"/>
+        <w:szCs w:val="20"/>
+      </w:rPr>
+    </w:pPr>
+    <w:r>
+      <w:rPr>
+        <w:rtl w:val="0"/>
+      </w:rPr>
+    </w:r>
+  </w:p>
+</w:hdr>
 </file>
 
 <file path=word/numbering.xml><?xml version="1.0" encoding="utf-8"?>

</xml_diff>

<commit_message>
Actualizacion 5: Debate en duos y retroalimentacion de proyectos
</commit_message>
<xml_diff>
--- a/Bitácora de Clases - Técnicas de IA.docx
+++ b/Bitácora de Clases - Técnicas de IA.docx
@@ -555,65 +555,32 @@
       </w:pPr>
       <w:r>
         <w:rPr>
+          <w:rtl w:val="0"/>
+        </w:rPr>
+      </w:r>
+    </w:p>
+    <w:p>
+      <w:pPr>
+        <w:spacing w:line="275.9999942779541" w:lineRule="auto"/>
+        <w:jc w:val="center"/>
+        <w:rPr>
           <w:b w:val="1"/>
           <w:bCs w:val="1"/>
           <w:i w:val="1"/>
           <w:iCs w:val="1"/>
           <w:u w:val="single"/>
-          <w:rtl w:val="0"/>
-        </w:rPr>
-        <w:t xml:space="preserve">Semana del 31 de Agosto al 4 de Septiembre:</w:t>
-      </w:r>
-    </w:p>
-    <w:p>
-      <w:pPr>
-        <w:spacing w:line="275.9999942779541" w:lineRule="auto"/>
-        <w:jc w:val="center"/>
+        </w:rPr>
+      </w:pPr>
+      <w:r>
         <w:rPr>
           <w:b w:val="1"/>
           <w:bCs w:val="1"/>
           <w:i w:val="1"/>
           <w:iCs w:val="1"/>
           <w:u w:val="single"/>
-        </w:rPr>
-      </w:pPr>
-      <w:r>
-        <w:rPr>
-          <w:rtl w:val="0"/>
-        </w:rPr>
-      </w:r>
-    </w:p>
-    <w:p>
-      <w:pPr>
-        <w:pStyle w:val="Heading2"/>
-        <w:rPr>
-          <w:color w:val="34495e"/>
-        </w:rPr>
-      </w:pPr>
-      <w:bookmarkStart w:colFirst="0" w:colLast="0" w:name="_f1juol8xxl38" w:id="0"/>
-      <w:bookmarkEnd w:id="0"/>
-      <w:r>
-        <w:rPr>
-          <w:color w:val="34495e"/>
-          <w:rtl w:val="0"/>
-        </w:rPr>
-        <w:t xml:space="preserve">Día 4</w:t>
-      </w:r>
-    </w:p>
-    <w:p>
-      <w:pPr>
-        <w:rPr/>
-      </w:pPr>
-      <w:r>
-        <w:rPr>
-          <w:rtl w:val="0"/>
-        </w:rPr>
-        <w:t xml:space="preserve">En este día desglosamos con más detalle nuestro proyecto viable asignando un título en mi caso: WAItt (Water-Aware Artificial Intelligence Thermal-Throttling) junto con un planteamiento del problema una justificación digna, hipótesis junto con sus objetivos generales y específicos mediante alguna metodología agregando la fase de experimentación para llegar a una conclusión.</w:t>
-      </w:r>
-      <w:r>
-        <w:rPr>
-          <w:rtl w:val="0"/>
-        </w:rPr>
+          <w:rtl w:val="0"/>
+        </w:rPr>
+        <w:t xml:space="preserve">Semana del 31 de Agosto al 4 de Septiembre:</w:t>
       </w:r>
     </w:p>
     <w:p>
@@ -628,6 +595,90 @@
           <w:u w:val="single"/>
         </w:rPr>
       </w:pPr>
+      <w:r>
+        <w:rPr>
+          <w:rtl w:val="0"/>
+        </w:rPr>
+      </w:r>
+    </w:p>
+    <w:p>
+      <w:pPr>
+        <w:pStyle w:val="Heading2"/>
+        <w:rPr>
+          <w:color w:val="34495e"/>
+        </w:rPr>
+      </w:pPr>
+      <w:bookmarkStart w:colFirst="0" w:colLast="0" w:name="_f1juol8xxl38" w:id="0"/>
+      <w:bookmarkEnd w:id="0"/>
+      <w:r>
+        <w:rPr>
+          <w:color w:val="34495e"/>
+          <w:rtl w:val="0"/>
+        </w:rPr>
+        <w:t xml:space="preserve">Día 4</w:t>
+      </w:r>
+    </w:p>
+    <w:p>
+      <w:pPr>
+        <w:rPr/>
+      </w:pPr>
+      <w:r>
+        <w:rPr>
+          <w:rtl w:val="0"/>
+        </w:rPr>
+        <w:t xml:space="preserve">En este día desglosamos con más detalle nuestro proyecto viable asignando un título en mi caso: WAItt (Water-Aware Artificial Intelligence Thermal-Throttling) junto con un planteamiento del problema una justificación digna, hipótesis junto con sus objetivos generales y específicos mediante alguna metodología agregando la fase de experimentación para llegar a una conclusión.</w:t>
+      </w:r>
+      <w:r>
+        <w:rPr>
+          <w:rtl w:val="0"/>
+        </w:rPr>
+      </w:r>
+    </w:p>
+    <w:p>
+      <w:pPr>
+        <w:spacing w:line="275.9999942779541" w:lineRule="auto"/>
+        <w:jc w:val="center"/>
+        <w:rPr>
+          <w:b w:val="1"/>
+          <w:bCs w:val="1"/>
+          <w:i w:val="1"/>
+          <w:iCs w:val="1"/>
+          <w:u w:val="single"/>
+        </w:rPr>
+      </w:pPr>
+      <w:r>
+        <w:rPr>
+          <w:rtl w:val="0"/>
+        </w:rPr>
+      </w:r>
+    </w:p>
+    <w:p>
+      <w:pPr>
+        <w:pStyle w:val="Heading2"/>
+        <w:rPr>
+          <w:color w:val="34495e"/>
+        </w:rPr>
+      </w:pPr>
+      <w:bookmarkStart w:colFirst="0" w:colLast="0" w:name="_fd1fasfkhhdp" w:id="1"/>
+      <w:bookmarkEnd w:id="1"/>
+      <w:r>
+        <w:rPr>
+          <w:color w:val="34495e"/>
+          <w:rtl w:val="0"/>
+        </w:rPr>
+        <w:t xml:space="preserve">Día 5</w:t>
+      </w:r>
+    </w:p>
+    <w:p>
+      <w:pPr>
+        <w:rPr/>
+      </w:pPr>
+      <w:r>
+        <w:rPr>
+          <w:rtl w:val="0"/>
+        </w:rPr>
+        <w:t xml:space="preserve">Este día trabajamos debatiendo en dúos acerca de las bases y planteamiento de nuestros proyectos, en base a recibir una retroalimentación mutua para mejorar el proyecto de cada uno, hubo tema de discusión con preguntas críticas para cada proyecto. El tema de mi compañera de actividad consistió en un organizador y optimizador de productos en tu alacena o refrigerador para dar ideas de recetas nutritivas en base a tus mismos productos.</w:t>
+      </w:r>
       <w:r>
         <w:rPr>
           <w:rtl w:val="0"/>

</xml_diff>

<commit_message>
Actualizacion 6: Recoleccion de proyectos y seleccion de WAItt como el más viable
</commit_message>
<xml_diff>
--- a/Bitácora de Clases - Técnicas de IA.docx
+++ b/Bitácora de Clases - Técnicas de IA.docx
@@ -679,10 +679,59 @@
         </w:rPr>
         <w:t xml:space="preserve">Este día trabajamos debatiendo en dúos acerca de las bases y planteamiento de nuestros proyectos, en base a recibir una retroalimentación mutua para mejorar el proyecto de cada uno, hubo tema de discusión con preguntas críticas para cada proyecto. El tema de mi compañera de actividad consistió en un organizador y optimizador de productos en tu alacena o refrigerador para dar ideas de recetas nutritivas en base a tus mismos productos.</w:t>
       </w:r>
-      <w:r>
-        <w:rPr>
-          <w:rtl w:val="0"/>
-        </w:rPr>
+    </w:p>
+    <w:p>
+      <w:pPr>
+        <w:rPr/>
+      </w:pPr>
+      <w:r>
+        <w:rPr>
+          <w:rtl w:val="0"/>
+        </w:rPr>
+      </w:r>
+    </w:p>
+    <w:p>
+      <w:pPr>
+        <w:pStyle w:val="Heading2"/>
+        <w:rPr>
+          <w:color w:val="34495e"/>
+        </w:rPr>
+      </w:pPr>
+      <w:bookmarkStart w:colFirst="0" w:colLast="0" w:name="_rwumdie9p1xr" w:id="2"/>
+      <w:bookmarkEnd w:id="2"/>
+      <w:r>
+        <w:rPr>
+          <w:color w:val="34495e"/>
+          <w:rtl w:val="0"/>
+        </w:rPr>
+        <w:t xml:space="preserve">Día 6</w:t>
+      </w:r>
+    </w:p>
+    <w:p>
+      <w:pPr>
+        <w:rPr/>
+      </w:pPr>
+      <w:r>
+        <w:rPr>
+          <w:rtl w:val="0"/>
+        </w:rPr>
+        <w:t xml:space="preserve">En este día realizamos una actividad en donde recolectamos nombres de compañeros de aula y su proyecto junto con una breve explicación de su proyecto, después de eso nuevamente en parejas debatimos en base a los proyectos que recolectamos cual sería el más viable teniendo en cuenta la modularidad y la escalabilidad. Mi compañero y yo decidimos que de aproximadamente los 14 proyectos candidatos, WAItt sería el más factible y viable. </w:t>
+      </w:r>
+      <w:r>
+        <w:rPr>
+          <w:rtl w:val="0"/>
+        </w:rPr>
+      </w:r>
+    </w:p>
+    <w:p>
+      <w:pPr>
+        <w:rPr/>
+      </w:pPr>
+      <w:r>
+        <w:rPr>
+          <w:rtl w:val="0"/>
+        </w:rPr>
+        <w:t xml:space="preserve"> </w:t>
       </w:r>
     </w:p>
     <w:p>

</xml_diff>

<commit_message>
Actualizacion 7: Investigacion del estado del arte y fuentes similares para WAItt
</commit_message>
<xml_diff>
--- a/Bitácora de Clases - Técnicas de IA.docx
+++ b/Bitácora de Clases - Técnicas de IA.docx
@@ -774,6 +774,320 @@
       <w:pPr>
         <w:spacing w:line="275.9999942779541" w:lineRule="auto"/>
         <w:jc w:val="center"/>
+        <w:rPr>
+          <w:b w:val="1"/>
+          <w:bCs w:val="1"/>
+          <w:i w:val="1"/>
+          <w:iCs w:val="1"/>
+          <w:u w:val="single"/>
+        </w:rPr>
+      </w:pPr>
+      <w:r>
+        <w:rPr>
+          <w:rtl w:val="0"/>
+        </w:rPr>
+      </w:r>
+    </w:p>
+    <w:p>
+      <w:pPr>
+        <w:spacing w:line="275.9999942779541" w:lineRule="auto"/>
+        <w:jc w:val="center"/>
+        <w:rPr>
+          <w:b w:val="1"/>
+          <w:bCs w:val="1"/>
+          <w:i w:val="1"/>
+          <w:iCs w:val="1"/>
+          <w:u w:val="single"/>
+        </w:rPr>
+      </w:pPr>
+      <w:r>
+        <w:rPr>
+          <w:rtl w:val="0"/>
+        </w:rPr>
+      </w:r>
+    </w:p>
+    <w:p>
+      <w:pPr>
+        <w:spacing w:line="275.9999942779541" w:lineRule="auto"/>
+        <w:jc w:val="center"/>
+        <w:rPr>
+          <w:b w:val="1"/>
+          <w:bCs w:val="1"/>
+          <w:i w:val="1"/>
+          <w:iCs w:val="1"/>
+          <w:u w:val="single"/>
+        </w:rPr>
+      </w:pPr>
+      <w:r>
+        <w:rPr>
+          <w:rtl w:val="0"/>
+        </w:rPr>
+      </w:r>
+    </w:p>
+    <w:p>
+      <w:pPr>
+        <w:spacing w:line="275.9999942779541" w:lineRule="auto"/>
+        <w:jc w:val="center"/>
+        <w:rPr>
+          <w:b w:val="1"/>
+          <w:bCs w:val="1"/>
+          <w:i w:val="1"/>
+          <w:iCs w:val="1"/>
+          <w:u w:val="single"/>
+        </w:rPr>
+      </w:pPr>
+      <w:r>
+        <w:rPr>
+          <w:rtl w:val="0"/>
+        </w:rPr>
+      </w:r>
+    </w:p>
+    <w:p>
+      <w:pPr>
+        <w:spacing w:line="275.9999942779541" w:lineRule="auto"/>
+        <w:jc w:val="center"/>
+        <w:rPr>
+          <w:b w:val="1"/>
+          <w:bCs w:val="1"/>
+          <w:i w:val="1"/>
+          <w:iCs w:val="1"/>
+          <w:u w:val="single"/>
+        </w:rPr>
+      </w:pPr>
+      <w:r>
+        <w:rPr>
+          <w:rtl w:val="0"/>
+        </w:rPr>
+      </w:r>
+    </w:p>
+    <w:p>
+      <w:pPr>
+        <w:spacing w:line="275.9999942779541" w:lineRule="auto"/>
+        <w:jc w:val="center"/>
+        <w:rPr>
+          <w:b w:val="1"/>
+          <w:bCs w:val="1"/>
+          <w:i w:val="1"/>
+          <w:iCs w:val="1"/>
+          <w:u w:val="single"/>
+        </w:rPr>
+      </w:pPr>
+      <w:r>
+        <w:rPr>
+          <w:rtl w:val="0"/>
+        </w:rPr>
+      </w:r>
+    </w:p>
+    <w:p>
+      <w:pPr>
+        <w:spacing w:line="275.9999942779541" w:lineRule="auto"/>
+        <w:jc w:val="center"/>
+        <w:rPr>
+          <w:b w:val="1"/>
+          <w:bCs w:val="1"/>
+          <w:i w:val="1"/>
+          <w:iCs w:val="1"/>
+          <w:u w:val="single"/>
+        </w:rPr>
+      </w:pPr>
+      <w:r>
+        <w:rPr>
+          <w:rtl w:val="0"/>
+        </w:rPr>
+      </w:r>
+    </w:p>
+    <w:p>
+      <w:pPr>
+        <w:spacing w:line="275.9999942779541" w:lineRule="auto"/>
+        <w:jc w:val="center"/>
+        <w:rPr>
+          <w:b w:val="1"/>
+          <w:bCs w:val="1"/>
+          <w:i w:val="1"/>
+          <w:iCs w:val="1"/>
+          <w:u w:val="single"/>
+        </w:rPr>
+      </w:pPr>
+      <w:r>
+        <w:rPr>
+          <w:rtl w:val="0"/>
+        </w:rPr>
+      </w:r>
+    </w:p>
+    <w:p>
+      <w:pPr>
+        <w:spacing w:line="275.9999942779541" w:lineRule="auto"/>
+        <w:jc w:val="center"/>
+        <w:rPr>
+          <w:b w:val="1"/>
+          <w:bCs w:val="1"/>
+          <w:i w:val="1"/>
+          <w:iCs w:val="1"/>
+          <w:u w:val="single"/>
+        </w:rPr>
+      </w:pPr>
+      <w:r>
+        <w:rPr>
+          <w:rtl w:val="0"/>
+        </w:rPr>
+      </w:r>
+    </w:p>
+    <w:p>
+      <w:pPr>
+        <w:spacing w:line="275.9999942779541" w:lineRule="auto"/>
+        <w:jc w:val="center"/>
+        <w:rPr>
+          <w:b w:val="1"/>
+          <w:bCs w:val="1"/>
+          <w:i w:val="1"/>
+          <w:iCs w:val="1"/>
+          <w:u w:val="single"/>
+        </w:rPr>
+      </w:pPr>
+      <w:r>
+        <w:rPr>
+          <w:rtl w:val="0"/>
+        </w:rPr>
+      </w:r>
+    </w:p>
+    <w:p>
+      <w:pPr>
+        <w:spacing w:line="275.9999942779541" w:lineRule="auto"/>
+        <w:jc w:val="center"/>
+        <w:rPr>
+          <w:b w:val="1"/>
+          <w:bCs w:val="1"/>
+          <w:i w:val="1"/>
+          <w:iCs w:val="1"/>
+          <w:u w:val="single"/>
+        </w:rPr>
+      </w:pPr>
+      <w:r>
+        <w:rPr>
+          <w:rtl w:val="0"/>
+        </w:rPr>
+      </w:r>
+    </w:p>
+    <w:p>
+      <w:pPr>
+        <w:spacing w:line="275.9999942779541" w:lineRule="auto"/>
+        <w:jc w:val="center"/>
+        <w:rPr>
+          <w:b w:val="1"/>
+          <w:bCs w:val="1"/>
+          <w:i w:val="1"/>
+          <w:iCs w:val="1"/>
+          <w:u w:val="single"/>
+        </w:rPr>
+      </w:pPr>
+      <w:r>
+        <w:rPr>
+          <w:rtl w:val="0"/>
+        </w:rPr>
+      </w:r>
+    </w:p>
+    <w:p>
+      <w:pPr>
+        <w:spacing w:line="275.9999942779541" w:lineRule="auto"/>
+        <w:jc w:val="center"/>
+        <w:rPr>
+          <w:b w:val="1"/>
+          <w:bCs w:val="1"/>
+          <w:i w:val="1"/>
+          <w:iCs w:val="1"/>
+          <w:u w:val="single"/>
+        </w:rPr>
+      </w:pPr>
+      <w:r>
+        <w:rPr>
+          <w:rtl w:val="0"/>
+        </w:rPr>
+      </w:r>
+    </w:p>
+    <w:p>
+      <w:pPr>
+        <w:spacing w:line="275.9999942779541" w:lineRule="auto"/>
+        <w:jc w:val="center"/>
+        <w:rPr>
+          <w:b w:val="1"/>
+          <w:bCs w:val="1"/>
+          <w:i w:val="1"/>
+          <w:iCs w:val="1"/>
+          <w:u w:val="single"/>
+        </w:rPr>
+      </w:pPr>
+      <w:r>
+        <w:rPr>
+          <w:b w:val="1"/>
+          <w:bCs w:val="1"/>
+          <w:i w:val="1"/>
+          <w:iCs w:val="1"/>
+          <w:u w:val="single"/>
+          <w:rtl w:val="0"/>
+        </w:rPr>
+        <w:t xml:space="preserve">Semana del 7 al 11 de Septiembre:</w:t>
+      </w:r>
+    </w:p>
+    <w:p>
+      <w:pPr>
+        <w:pStyle w:val="Heading2"/>
+        <w:rPr>
+          <w:color w:val="34495e"/>
+        </w:rPr>
+      </w:pPr>
+      <w:bookmarkStart w:colFirst="0" w:colLast="0" w:name="_87frwfl0dcfd" w:id="3"/>
+      <w:bookmarkEnd w:id="3"/>
+      <w:r>
+        <w:rPr>
+          <w:color w:val="34495e"/>
+          <w:rtl w:val="0"/>
+        </w:rPr>
+        <w:t xml:space="preserve">Día 7</w:t>
+      </w:r>
+    </w:p>
+    <w:p>
+      <w:pPr>
+        <w:rPr/>
+      </w:pPr>
+      <w:r>
+        <w:rPr>
+          <w:rtl w:val="0"/>
+        </w:rPr>
+        <w:t xml:space="preserve">En esta sesión nos enfocamos en la búsqueda y revisión del estado del arte para nuestro proyecto WAItt. Realizamos una investigación exhaustiva en fuentes confiables y académicas (como Google Scholar) para identificar trabajos previos y antecedentes que aborden temas similares, tales como la gestión térmica en sistemas informáticos, el monitoreo del consumo energético y la optimización de recursos en hardware. Esto nos permitió fundamentar teóricamente la necesidad de nuestra propuesta y compararla con soluciones existentes en la literatura científica.</w:t>
+      </w:r>
+    </w:p>
+    <w:p>
+      <w:pPr>
+        <w:rPr/>
+      </w:pPr>
+      <w:r>
+        <w:rPr>
+          <w:rtl w:val="0"/>
+        </w:rPr>
+      </w:r>
+    </w:p>
+    <w:p>
+      <w:pPr>
+        <w:spacing w:line="275.9999942779541" w:lineRule="auto"/>
+        <w:jc w:val="left"/>
+        <w:rPr>
+          <w:b w:val="1"/>
+          <w:bCs w:val="1"/>
+          <w:i w:val="1"/>
+          <w:iCs w:val="1"/>
+          <w:u w:val="single"/>
+        </w:rPr>
+      </w:pPr>
+      <w:r>
+        <w:rPr>
+          <w:rtl w:val="0"/>
+        </w:rPr>
+      </w:r>
+    </w:p>
+    <w:p>
+      <w:pPr>
+        <w:spacing w:line="275.9999942779541" w:lineRule="auto"/>
+        <w:jc w:val="left"/>
         <w:rPr>
           <w:b w:val="1"/>
           <w:bCs w:val="1"/>

</xml_diff>

<commit_message>
Actualizacion 8: Investigacion tecnica y presupuesto de componentes para WAItt
</commit_message>
<xml_diff>
--- a/Bitácora de Clases - Técnicas de IA.docx
+++ b/Bitácora de Clases - Técnicas de IA.docx
@@ -1086,16 +1086,31 @@
     </w:p>
     <w:p>
       <w:pPr>
-        <w:spacing w:line="275.9999942779541" w:lineRule="auto"/>
-        <w:jc w:val="left"/>
-        <w:rPr>
-          <w:b w:val="1"/>
-          <w:bCs w:val="1"/>
-          <w:i w:val="1"/>
-          <w:iCs w:val="1"/>
-          <w:u w:val="single"/>
-        </w:rPr>
-      </w:pPr>
+        <w:pStyle w:val="Heading2"/>
+        <w:rPr>
+          <w:color w:val="34495e"/>
+        </w:rPr>
+      </w:pPr>
+      <w:bookmarkStart w:colFirst="0" w:colLast="0" w:name="_mnkwd0swb0qk" w:id="4"/>
+      <w:bookmarkEnd w:id="4"/>
+      <w:r>
+        <w:rPr>
+          <w:color w:val="34495e"/>
+          <w:rtl w:val="0"/>
+        </w:rPr>
+        <w:t xml:space="preserve">Día 8</w:t>
+      </w:r>
+    </w:p>
+    <w:p>
+      <w:pPr>
+        <w:rPr/>
+      </w:pPr>
+      <w:r>
+        <w:rPr>
+          <w:rtl w:val="0"/>
+        </w:rPr>
+        <w:t xml:space="preserve">Durante este día llevamos a cabo la investigación técnica y el presupuesto detallado de los componentes necesarios para el desarrollo e implementación del proyecto WAItt. Analizamos las especificaciones de hardware requeridas para el monitoreo de temperatura y el control de rendimiento (como sensores, microcontroladores y módulos de prueba), cotizando precios en el mercado actual para evaluar la viabilidad financiera del prototipo y asegurar que se ajuste a un presupuesto accesible. </w:t>
+      </w:r>
       <w:r>
         <w:rPr>
           <w:rtl w:val="0"/>

</xml_diff>

<commit_message>
Actualizacion 9: Planteamiento de aplicabilidad comercial y uso real en empresas
</commit_message>
<xml_diff>
--- a/Bitácora de Clases - Técnicas de IA.docx
+++ b/Bitácora de Clases - Técnicas de IA.docx
@@ -1111,6 +1111,54 @@
         </w:rPr>
         <w:t xml:space="preserve">Durante este día llevamos a cabo la investigación técnica y el presupuesto detallado de los componentes necesarios para el desarrollo e implementación del proyecto WAItt. Analizamos las especificaciones de hardware requeridas para el monitoreo de temperatura y el control de rendimiento (como sensores, microcontroladores y módulos de prueba), cotizando precios en el mercado actual para evaluar la viabilidad financiera del prototipo y asegurar que se ajuste a un presupuesto accesible. </w:t>
       </w:r>
+    </w:p>
+    <w:p>
+      <w:pPr>
+        <w:rPr/>
+      </w:pPr>
+      <w:r>
+        <w:rPr>
+          <w:rtl w:val="0"/>
+        </w:rPr>
+      </w:r>
+    </w:p>
+    <w:p>
+      <w:pPr>
+        <w:pStyle w:val="Heading2"/>
+        <w:rPr>
+          <w:color w:val="34495e"/>
+        </w:rPr>
+      </w:pPr>
+      <w:bookmarkStart w:colFirst="0" w:colLast="0" w:name="_6a59yoxokrkw" w:id="5"/>
+      <w:bookmarkEnd w:id="5"/>
+      <w:r>
+        <w:rPr>
+          <w:color w:val="34495e"/>
+          <w:rtl w:val="0"/>
+        </w:rPr>
+        <w:t xml:space="preserve">Día 9</w:t>
+      </w:r>
+    </w:p>
+    <w:p>
+      <w:pPr>
+        <w:rPr/>
+      </w:pPr>
+      <w:r>
+        <w:rPr>
+          <w:rtl w:val="0"/>
+        </w:rPr>
+        <w:t xml:space="preserve">En esta etapa realizamos un análisis crítico sobre el planteamiento del uso real y la aplicabilidad comercial de WAItt en el entorno industrial y profesional. Debatimos y evaluamos si las empresas e industrias tecnológicas realmente adoptarían e implementarían una solución de este tipo, considerando factores clave como el retorno de inversión, la reducción de costos por fallas térmicas en equipos y la optimización en la eficiencia operativa diaria de los centros de datos. </w:t>
+      </w:r>
+      <w:r>
+        <w:rPr>
+          <w:rtl w:val="0"/>
+        </w:rPr>
+      </w:r>
+    </w:p>
+    <w:p>
+      <w:pPr>
+        <w:rPr/>
+      </w:pPr>
       <w:r>
         <w:rPr>
           <w:rtl w:val="0"/>

</xml_diff>